<commit_message>
Improve instruct CLI file picker
</commit_message>
<xml_diff>
--- a/sample.docx
+++ b/sample.docx
@@ -222,6 +222,33 @@
       <w:sz w:val="24"/>
     </w:rPr>
   </w:style>
+  <w:style w:type="paragraph" w:styleId="Heading4">
+    <w:name w:val="heading 4"/>
+    <w:basedOn w:val="Normal"/>
+    <w:qFormat/>
+    <w:rPr>
+      <w:b/>
+      <w:sz w:val="22"/>
+    </w:rPr>
+  </w:style>
+  <w:style w:type="paragraph" w:styleId="Heading5">
+    <w:name w:val="heading 5"/>
+    <w:basedOn w:val="Normal"/>
+    <w:qFormat/>
+    <w:rPr>
+      <w:b/>
+      <w:sz w:val="20"/>
+    </w:rPr>
+  </w:style>
+  <w:style w:type="paragraph" w:styleId="Heading6">
+    <w:name w:val="heading 6"/>
+    <w:basedOn w:val="Normal"/>
+    <w:qFormat/>
+    <w:rPr>
+      <w:b/>
+      <w:sz w:val="18"/>
+    </w:rPr>
+  </w:style>
   <w:style w:type="paragraph" w:styleId="Quote">
     <w:name w:val="Quote"/>
     <w:basedOn w:val="Normal"/>

</xml_diff>